<commit_message>
STAT_IAS N01–N03: Džamovi/Eksel u prezentacijama, videima, vežbama i domaćim
Co-Authored-By: Claude Opus 5.5 <noreply@anthropic.com>
</commit_message>
<xml_diff>
--- a/predmeti/stat-ias/n02/STAT_IAS_N02_Homework_Assignment_SR.docx
+++ b/predmeti/stat-ias/n02/STAT_IAS_N02_Homework_Assignment_SR.docx
@@ -43,7 +43,7 @@
         <w:rPr>
           <w:i w:val="0"/>
         </w:rPr>
-        <w:t>Nastavnik fizičkog vaspitanja testirao je skok udalj iz mesta u četiri odeljenja 7. razreda (VII-1 do VII-4), prema protokolu iz Priručnika za praćenje fizičkog razvoja i razvoja motoričkih sposobnosti učenika (Milanović i sar., 2016): sunožni odskok i doskok, tri skoka, meri se od linije odskoka do tačke dodira pete najbliže liniji, trakom sa tačnošću od 1 cm; beleži se najdalji skok. Rezultate je upisivao u Excel, svako odeljenje na poseban list. Vaš zadatak je da te podatke pripremite za analizu i prikažete ih tabelama i grafikonima, istim postupkom kao na času.</w:t>
+        <w:t>Nastavnik fizičkog vaspitanja testirao je skok udalj iz mesta u četiri odeljenja 7. razreda (VII-1 do VII-4), prema protokolu iz Priručnika za praćenje fizičkog razvoja i razvoja motoričkih sposobnosti učenika (Milanović i sar., 2016): sunožni odskok i doskok, tri skoka, meri se od linije odskoka do tačke dodira pete najbliže liniji, trakom sa tačnošću od 1 cm; beleži se najdalji skok. Rezultate je upisivao u Eksel (Excel), svako odeljenje na poseban list. Vaš zadatak je da te podatke pripremite za analizu i prikažete ih tabelama i grafikonima, istim postupkom kao na času.</w:t>
       </w:r>
     </w:p>
     <w:p>
@@ -363,7 +363,7 @@
           <w:b/>
           <w:color w:val="1F3A93"/>
         </w:rPr>
-        <w:t xml:space="preserve">1. Matrica podataka (Excel) </w:t>
+        <w:t xml:space="preserve">1. Matrica podataka u Ekselu </w:t>
       </w:r>
       <w:r>
         <w:rPr>
@@ -374,7 +374,7 @@
     </w:p>
     <w:p>
       <w:r>
-        <w:t>Četiri lista (po odeljenju) spojite u jednu matricu na jednom listu: jedan red = jedan učenik, jedna kolona = jedna varijabla. Kolone: ID, Odeljenje, Br, Pol, Skok1, Skok2, Skok3. Uklonite naslov i prazan red iznad zaglavlja. ID neka bude jedinstven redni broj od 1 do 104 (broj u dnevniku se ponavlja u svakom odeljenju, zato nije dovoljan). Kod odsutnih učenika ćelije sa skokovima ostaju PRAZNE (ne upisujte 0). Kolonu Napomena ne prenosite u matricu. Sačuvajte matricu kao Excel fajl sa jednim listom (.xlsx).</w:t>
+        <w:t>Četiri lista (po odeljenju) spojite u jednu matricu na jednom listu: jedan red = jedan učenik, jedna kolona = jedna varijabla. Kolone: ID, Odeljenje, Br, Pol, Skok1, Skok2, Skok3. Uklonite naslov i prazan red iznad zaglavlja. ID neka bude jedinstven redni broj od 1 do 104 (broj u dnevniku se ponavlja u svakom odeljenju, zato nije dovoljan). Kod odsutnih učenika ćelije sa skokovima ostaju PRAZNE (ne upisujte 0). Kolonu Napomena ne prenosite u matricu. Sačuvajte matricu kao Eksel fajl sa jednim listom (.xlsx).</w:t>
       </w:r>
     </w:p>
     <w:p>
@@ -383,7 +383,7 @@
           <w:b/>
           <w:color w:val="1F3A93"/>
         </w:rPr>
-        <w:t xml:space="preserve">2. Vrste varijabli (Jamovi) </w:t>
+        <w:t xml:space="preserve">2. Vrste varijabli (Džamovi (jamovi)) </w:t>
       </w:r>
       <w:r>
         <w:rPr>
@@ -394,7 +394,7 @@
     </w:p>
     <w:p>
       <w:r>
-        <w:t>Otvorite matricu u Jamovi-ju i proverite vrstu svake varijable: ID → ID; Odeljenje i Pol → Nominal; Skok1–3 → Continuous. Ispravite ono što Jamovi nije sam dobro prepoznao.</w:t>
+        <w:t>Otvorite matricu u Džamoviju i proverite vrstu svake varijable: ID → ID; Odeljenje i Pol → Nominal; Skok1–3 → Continuous. Ispravite ono što Džamovi nije sam dobro prepoznao.</w:t>
       </w:r>
     </w:p>
     <w:p>
@@ -770,7 +770,7 @@
         <w:rPr>
           <w:b/>
         </w:rPr>
-        <w:t>Excel:</w:t>
+        <w:t>Eksel:</w:t>
       </w:r>
       <w:r>
         <w:t xml:space="preserve"> matricu (.xlsx, jedan list);</w:t>
@@ -784,7 +784,7 @@
         <w:rPr>
           <w:b/>
         </w:rPr>
-        <w:t>Jamovi:</w:t>
+        <w:t>Džamovi:</w:t>
       </w:r>
       <w:r>
         <w:t xml:space="preserve"> fajl sa podacima, izvedenim kolonama i analizama (.omv);</w:t>
@@ -825,7 +825,7 @@
         <w:rPr>
           <w:i w:val="0"/>
         </w:rPr>
-        <w:t>Isti koraci prikazani su u video zapisima vežbe N02: sređivanje podataka u Excel-u i priprema i prikaz podataka u Jamovi-ju. Za Jamovi: matricu čuvajte kao Excel fajl sa jednim listom, ne kao CSV (CSV iz Excel-a sa srpskim podešavanjima može pogrešno da prenese decimalni zarez).</w:t>
+        <w:t>Isti koraci prikazani su u video zapisima vežbe N02: sređivanje podataka u Ekselu i priprema i prikaz podataka u Džamoviju. Za Džamovi: matricu čuvajte kao Eksel fajl sa jednim listom, ne kao CSV (CSV iz Eksela sa srpskim podešavanjima može pogrešno da prenese decimalni zarez).</w:t>
       </w:r>
     </w:p>
     <w:p>

</xml_diff>

<commit_message>
Napomena o upotrebi veštačke inteligencije (podnožje, završni slajd u videima, dokumenti); OIT i ISFVSP N04 pregled asistenata (naslov), ostale lekcije pomerene
</commit_message>
<xml_diff>
--- a/predmeti/stat-ias/n02/STAT_IAS_N02_Homework_Assignment_SR.docx
+++ b/predmeti/stat-ias/n02/STAT_IAS_N02_Homework_Assignment_SR.docx
@@ -924,6 +924,19 @@
         <w:t>Wickham, H. (2014). Tidy data. Journal of Statistical Software, 59(10), 1–23. https://doi.org/10.18637/jss.v059.i10</w:t>
       </w:r>
     </w:p>
+    <w:p>
+      <w:pPr>
+        <w:spacing w:before="240"/>
+      </w:pPr>
+      <w:r>
+        <w:rPr>
+          <w:i/>
+          <w:color w:val="66707A"/>
+          <w:sz w:val="16"/>
+        </w:rPr>
+        <w:t>Upotreba veštačke inteligencije: autor je vodio izradu ovog materijala od ideje do gotovog sadržaja — osmislio ga je, postavio pravila pisanja i upotrebe jezika i proverio svaki deo. Kao pomoć je korišćen Claude Code (Anthropic), asistent zasnovan na veštačkoj inteligenciji: za pisanje programa kojima su napravljeni slajdovi, slike i dokumenti, za predloge teksta i za jezičku proveru po pravilima autora. Za sadržaj odgovara autor.</w:t>
+      </w:r>
+    </w:p>
     <w:sectPr>
       <w:pgSz w:w="12240" w:h="15840"/>
       <w:pgMar w:top="1134" w:right="1247" w:bottom="1134" w:left="1247" w:header="720" w:footer="720" w:gutter="0"/>

</xml_diff>

<commit_message>
Literatura (APA 7) u svim lekcijama i dokumentima: OIT N02, AI etika, vežba semafor, uputstvo Vandrajv; ispravljeni spiskovi STAT_IAS
</commit_message>
<xml_diff>
--- a/predmeti/stat-ias/n02/STAT_IAS_N02_Homework_Assignment_SR.docx
+++ b/predmeti/stat-ias/n02/STAT_IAS_N02_Homework_Assignment_SR.docx
@@ -842,9 +842,38 @@
       </w:pPr>
       <w:r>
         <w:rPr>
+          <w:i w:val="0"/>
           <w:sz w:val="20"/>
         </w:rPr>
-        <w:t>Broman, K. W., &amp; Woo, K. H. (2018). Data organization in spreadsheets. The American Statistician, 72(1), 2–10. https://doi.org/10.1080/00031305.2017.1375989</w:t>
+        <w:t xml:space="preserve">Broman, K. W., &amp; Woo, K. H. (2018). Data organization in spreadsheets. </w:t>
+      </w:r>
+      <w:r>
+        <w:rPr>
+          <w:i/>
+          <w:sz w:val="20"/>
+        </w:rPr>
+        <w:t>The American Statistician</w:t>
+      </w:r>
+      <w:r>
+        <w:rPr>
+          <w:i w:val="0"/>
+          <w:sz w:val="20"/>
+        </w:rPr>
+        <w:t xml:space="preserve">, </w:t>
+      </w:r>
+      <w:r>
+        <w:rPr>
+          <w:i/>
+          <w:sz w:val="20"/>
+        </w:rPr>
+        <w:t>72</w:t>
+      </w:r>
+      <w:r>
+        <w:rPr>
+          <w:i w:val="0"/>
+          <w:sz w:val="20"/>
+        </w:rPr>
+        <w:t>(1), 2–10. https://doi.org/10.1080/00031305.2017.1375989</w:t>
       </w:r>
     </w:p>
     <w:p>
@@ -853,9 +882,24 @@
       </w:pPr>
       <w:r>
         <w:rPr>
+          <w:i w:val="0"/>
           <w:sz w:val="20"/>
         </w:rPr>
-        <w:t>Dizdar, D. (2006). Kvantitativne metode. Zagreb: Kineziološki fakultet Sveučilišta u Zagrebu.</w:t>
+        <w:t xml:space="preserve">Dizdar, D. (2006). </w:t>
+      </w:r>
+      <w:r>
+        <w:rPr>
+          <w:i/>
+          <w:sz w:val="20"/>
+        </w:rPr>
+        <w:t>Kvantitativne metode</w:t>
+      </w:r>
+      <w:r>
+        <w:rPr>
+          <w:i w:val="0"/>
+          <w:sz w:val="20"/>
+        </w:rPr>
+        <w:t>. Kineziološki fakultet Sveučilišta u Zagrebu.</w:t>
       </w:r>
     </w:p>
     <w:p>
@@ -864,9 +908,24 @@
       </w:pPr>
       <w:r>
         <w:rPr>
+          <w:i w:val="0"/>
           <w:sz w:val="20"/>
         </w:rPr>
-        <w:t>Milanović, I., Radisavljević Janić, S., Čaprić, G., &amp; Mirkov, D. (2016). Priručnik za praćenje fizičkog razvoja i razvoja motoričkih sposobnosti učenika u nastavi fizičkog vaspitanja. Beograd: Zavod za vrednovanje kvaliteta obrazovanja i vaspitanja. ISBN 978-86-86715-61-6.</w:t>
+        <w:t xml:space="preserve">Milanović, I., Radisavljević Janić, S., Čaprić, G., &amp; Mirkov, D. (2016). </w:t>
+      </w:r>
+      <w:r>
+        <w:rPr>
+          <w:i/>
+          <w:sz w:val="20"/>
+        </w:rPr>
+        <w:t>Priručnik za praćenje fizičkog razvoja i razvoja motoričkih sposobnosti učenika u nastavi fizičkog vaspitanja</w:t>
+      </w:r>
+      <w:r>
+        <w:rPr>
+          <w:i w:val="0"/>
+          <w:sz w:val="20"/>
+        </w:rPr>
+        <w:t>. Zavod za vrednovanje kvaliteta obrazovanja i vaspitanja.</w:t>
       </w:r>
     </w:p>
     <w:p>
@@ -875,9 +934,38 @@
       </w:pPr>
       <w:r>
         <w:rPr>
+          <w:i w:val="0"/>
           <w:sz w:val="20"/>
         </w:rPr>
-        <w:t>Milanovic, I., Radisavljevic-Janic, S., Zivkovic, M. Z., &amp; Mirkov, D. M. (2019). Health-related physical fitness levels and prevalence of obesity in Serbian elementary schoolchildren. Nutricion Hospitalaria, 36(2), 253–260. https://doi.org/10.20960/nh.2041 (PMID: 30834768)</w:t>
+        <w:t xml:space="preserve">Milanovic, I., Radisavljevic-Janic, S., Zivkovic, M. Z., &amp; Mirkov, D. M. (2019). Health-related physical fitness levels and prevalence of obesity in Serbian elementary schoolchildren. </w:t>
+      </w:r>
+      <w:r>
+        <w:rPr>
+          <w:i/>
+          <w:sz w:val="20"/>
+        </w:rPr>
+        <w:t>Nutrición Hospitalaria</w:t>
+      </w:r>
+      <w:r>
+        <w:rPr>
+          <w:i w:val="0"/>
+          <w:sz w:val="20"/>
+        </w:rPr>
+        <w:t xml:space="preserve">, </w:t>
+      </w:r>
+      <w:r>
+        <w:rPr>
+          <w:i/>
+          <w:sz w:val="20"/>
+        </w:rPr>
+        <w:t>36</w:t>
+      </w:r>
+      <w:r>
+        <w:rPr>
+          <w:i w:val="0"/>
+          <w:sz w:val="20"/>
+        </w:rPr>
+        <w:t>(2), 253–260. https://doi.org/10.20960/nh.2041</w:t>
       </w:r>
     </w:p>
     <w:p>
@@ -886,9 +974,38 @@
       </w:pPr>
       <w:r>
         <w:rPr>
+          <w:i w:val="0"/>
           <w:sz w:val="20"/>
         </w:rPr>
-        <w:t>Ortega, F. B., Leskošek, B., Blagus, R., Gil-Cosano, J. J., Mäestu, J., Tomkinson, G. R., … Jurak, G. (2023). European fitness landscape for children and adolescents: updated reference values, fitness maps and country rankings based on nearly 8 million test results from 34 countries gathered by the FitBack network. British Journal of Sports Medicine, 57(5), 299–310. https://doi.org/10.1136/bjsports-2022-106176 (PMID: 36623866)</w:t>
+        <w:t xml:space="preserve">Ortega, F. B., Leskošek, B., Blagus, R., Gil-Cosano, J. J., Mäestu, J., Tomkinson, G. R., Ruiz, J. R., Mäestu, E., Starc, G., Milanovic, I., Tammelin, T. H., Sorić, M., Scheuer, C., Carraro, A., Kaj, M., Csányi, T., Sardinha, L. B., Lenoir, M., Emeljanovas, A., . . . Jurak, G. (2023). European fitness landscape for children and adolescents: Updated reference values, fitness maps and country rankings based on nearly 8 million test results from 34 countries gathered by the FitBack network. </w:t>
+      </w:r>
+      <w:r>
+        <w:rPr>
+          <w:i/>
+          <w:sz w:val="20"/>
+        </w:rPr>
+        <w:t>British Journal of Sports Medicine</w:t>
+      </w:r>
+      <w:r>
+        <w:rPr>
+          <w:i w:val="0"/>
+          <w:sz w:val="20"/>
+        </w:rPr>
+        <w:t xml:space="preserve">, </w:t>
+      </w:r>
+      <w:r>
+        <w:rPr>
+          <w:i/>
+          <w:sz w:val="20"/>
+        </w:rPr>
+        <w:t>57</w:t>
+      </w:r>
+      <w:r>
+        <w:rPr>
+          <w:i w:val="0"/>
+          <w:sz w:val="20"/>
+        </w:rPr>
+        <w:t>(5), 299–310. https://doi.org/10.1136/bjsports-2022-106176</w:t>
       </w:r>
     </w:p>
     <w:p>
@@ -897,9 +1014,24 @@
       </w:pPr>
       <w:r>
         <w:rPr>
+          <w:i w:val="0"/>
           <w:sz w:val="20"/>
         </w:rPr>
-        <w:t>The jamovi project (2025). jamovi (Version 2.7) [Computer software]. https://www.jamovi.org</w:t>
+        <w:t xml:space="preserve">The jamovi project. (2025). </w:t>
+      </w:r>
+      <w:r>
+        <w:rPr>
+          <w:i/>
+          <w:sz w:val="20"/>
+        </w:rPr>
+        <w:t>jamovi</w:t>
+      </w:r>
+      <w:r>
+        <w:rPr>
+          <w:i w:val="0"/>
+          <w:sz w:val="20"/>
+        </w:rPr>
+        <w:t xml:space="preserve"> (Version 2.7) [Computer software]. https://www.jamovi.org</w:t>
       </w:r>
     </w:p>
     <w:p>
@@ -908,9 +1040,24 @@
       </w:pPr>
       <w:r>
         <w:rPr>
+          <w:i w:val="0"/>
           <w:sz w:val="20"/>
         </w:rPr>
-        <w:t>Vincent, W. J., &amp; Weir, J. P. (2012). Statistics in kinesiology (4th ed.). Champaign, IL: Human Kinetics.</w:t>
+        <w:t xml:space="preserve">Vincent, W. J., &amp; Weir, J. P. (2012). </w:t>
+      </w:r>
+      <w:r>
+        <w:rPr>
+          <w:i/>
+          <w:sz w:val="20"/>
+        </w:rPr>
+        <w:t>Statistics in kinesiology</w:t>
+      </w:r>
+      <w:r>
+        <w:rPr>
+          <w:i w:val="0"/>
+          <w:sz w:val="20"/>
+        </w:rPr>
+        <w:t xml:space="preserve"> (4th ed.). Human Kinetics.</w:t>
       </w:r>
     </w:p>
     <w:p>
@@ -919,9 +1066,38 @@
       </w:pPr>
       <w:r>
         <w:rPr>
+          <w:i w:val="0"/>
           <w:sz w:val="20"/>
         </w:rPr>
-        <w:t>Wickham, H. (2014). Tidy data. Journal of Statistical Software, 59(10), 1–23. https://doi.org/10.18637/jss.v059.i10</w:t>
+        <w:t xml:space="preserve">Wickham, H. (2014). Tidy data. </w:t>
+      </w:r>
+      <w:r>
+        <w:rPr>
+          <w:i/>
+          <w:sz w:val="20"/>
+        </w:rPr>
+        <w:t>Journal of Statistical Software</w:t>
+      </w:r>
+      <w:r>
+        <w:rPr>
+          <w:i w:val="0"/>
+          <w:sz w:val="20"/>
+        </w:rPr>
+        <w:t xml:space="preserve">, </w:t>
+      </w:r>
+      <w:r>
+        <w:rPr>
+          <w:i/>
+          <w:sz w:val="20"/>
+        </w:rPr>
+        <w:t>59</w:t>
+      </w:r>
+      <w:r>
+        <w:rPr>
+          <w:i w:val="0"/>
+          <w:sz w:val="20"/>
+        </w:rPr>
+        <w:t>(10), 1–23. https://doi.org/10.18637/jss.v059.i10</w:t>
       </w:r>
     </w:p>
     <w:p>

</xml_diff>